<commit_message>
SO-101 SOP: unambiguous motor-holder names and look-alike guide
Co-Authored-By: Claude Opus 5.5 <noreply@anthropic.com>
Claude-Session: https://claude.ai/code/session_01HbQ629ftEA4G6DUwmdU6eA
</commit_message>
<xml_diff>
--- a/so101/docs/SO-101_廠商列印需求說明.docx
+++ b/so101/docs/SO-101_廠商列印需求說明.docx
@@ -985,7 +985,7 @@
               <w:rPr>
                 <w:rFonts w:ascii="Arial" w:cs="Arial" w:eastAsia="Microsoft JhengHei" w:hAnsi="Arial"/>
               </w:rPr>
-              <w:t xml:space="preserve">第一個馬達座</w:t>
+              <w:t xml:space="preserve">馬達 1 固定座</w:t>
             </w:r>
           </w:p>
         </w:tc>
@@ -1103,7 +1103,7 @@
               <w:rPr>
                 <w:rFonts w:ascii="Arial" w:cs="Arial" w:eastAsia="Microsoft JhengHei" w:hAnsi="Arial"/>
               </w:rPr>
-              <w:t xml:space="preserve">肩部馬達座</w:t>
+              <w:t xml:space="preserve">馬達 2 固定座</w:t>
             </w:r>
           </w:p>
         </w:tc>
@@ -1575,7 +1575,7 @@
               <w:rPr>
                 <w:rFonts w:ascii="Arial" w:cs="Arial" w:eastAsia="Microsoft JhengHei" w:hAnsi="Arial"/>
               </w:rPr>
-              <w:t xml:space="preserve">馬達座 4</w:t>
+              <w:t xml:space="preserve">馬達 4 固定座</w:t>
             </w:r>
           </w:p>
         </w:tc>
@@ -2635,6 +2635,256 @@
                 <w:rFonts w:ascii="Arial" w:cs="Arial" w:eastAsia="Microsoft JhengHei" w:hAnsi="Arial"/>
               </w:rPr>
               <w:t xml:space="preserve">，那是整隻手臂的參考模型，不是零件。驅動板固定板只印 Waveshare 版，Seeedstudio_Mounting_Plate_SO101 不用印。</w:t>
+            </w:r>
+          </w:p>
+        </w:tc>
+      </w:tr>
+    </w:tbl>
+    <w:p>
+      <w:pPr>
+        <w:spacing w:after="60"/>
+      </w:pPr>
+    </w:p>
+    <w:p>
+      <w:pPr>
+        <w:spacing w:after="120" w:line="320"/>
+      </w:pPr>
+      <w:r>
+        <w:rPr>
+          <w:rFonts w:ascii="Arial" w:cs="Arial" w:eastAsia="Microsoft JhengHei" w:hAnsi="Arial"/>
+          <w:b/>
+          <w:bCs/>
+        </w:rPr>
+        <w:t xml:space="preserve">長得幾乎一樣的兩個零件，請分開包裝：</w:t>
+      </w:r>
+      <w:r>
+        <w:rPr>
+          <w:rFonts w:ascii="Arial" w:cs="Arial" w:eastAsia="Microsoft JhengHei" w:hAnsi="Arial"/>
+        </w:rPr>
+        <w:t xml:space="preserve">第 3 項 Motor_holder_SO101_Base 和第 7 項 Motor_holder_SO101_Wrist 外形非常像，尺寸只差 1 mm 多。差別在底邊：第 3 項底下有兩個突出的小卡勾，第 7 項底邊是平的，有三條橫紋。</w:t>
+      </w:r>
+    </w:p>
+    <w:tbl>
+      <w:tblPr>
+        <w:tblW w:type="dxa" w:w="9638"/>
+        <w:tblBorders>
+          <w:top w:val="single" w:color="auto" w:sz="4"/>
+          <w:left w:val="single" w:color="auto" w:sz="4"/>
+          <w:bottom w:val="single" w:color="auto" w:sz="4"/>
+          <w:right w:val="single" w:color="auto" w:sz="4"/>
+          <w:insideH w:val="single" w:color="auto" w:sz="4"/>
+          <w:insideV w:val="single" w:color="auto" w:sz="4"/>
+        </w:tblBorders>
+        <w:tblLayout w:type="fixed"/>
+      </w:tblPr>
+      <w:tblGrid>
+        <w:gridCol w:w="4819"/>
+        <w:gridCol w:w="4819"/>
+      </w:tblGrid>
+      <w:tr>
+        <w:tc>
+          <w:tcPr>
+            <w:tcW w:type="dxa" w:w="4819"/>
+            <w:tcBorders>
+              <w:top w:val="single" w:color="CFD9D3" w:sz="4"/>
+              <w:left w:val="single" w:color="CFD9D3" w:sz="4"/>
+              <w:bottom w:val="single" w:color="CFD9D3" w:sz="4"/>
+              <w:right w:val="single" w:color="CFD9D3" w:sz="4"/>
+            </w:tcBorders>
+            <w:tcMar>
+              <w:top w:type="dxa" w:w="80"/>
+              <w:left w:type="dxa" w:w="110"/>
+              <w:bottom w:type="dxa" w:w="80"/>
+              <w:right w:type="dxa" w:w="110"/>
+            </w:tcMar>
+          </w:tcPr>
+          <w:p>
+            <w:pPr>
+              <w:jc w:val="center"/>
+            </w:pPr>
+            <w:r>
+              <w:drawing>
+                <wp:inline distT="0" distB="0" distL="0" distR="0">
+                  <wp:extent cx="1428750" cy="1971675"/>
+                  <wp:effectExtent t="0" r="0" b="0" l="0"/>
+                  <wp:docPr id="1" name="Motor_holder_SO101_Base" descr="第 3 項　馬達 2 固定座，底下有小卡勾　55.1 × 38.1 × 28.0 mm" title="Motor_holder_SO101_Base"/>
+                  <wp:cNvGraphicFramePr>
+                    <a:graphicFrameLocks xmlns:a="http://schemas.openxmlformats.org/drawingml/2006/main" noChangeAspect="1"/>
+                  </wp:cNvGraphicFramePr>
+                  <a:graphic xmlns:a="http://schemas.openxmlformats.org/drawingml/2006/main">
+                    <a:graphicData uri="http://schemas.openxmlformats.org/drawingml/2006/picture">
+                      <pic:pic xmlns:pic="http://schemas.openxmlformats.org/drawingml/2006/picture">
+                        <pic:nvPicPr>
+                          <pic:cNvPr id="0" name="" descr=""/>
+                          <pic:cNvPicPr>
+                            <a:picLocks noChangeAspect="1" noChangeArrowheads="1"/>
+                          </pic:cNvPicPr>
+                        </pic:nvPicPr>
+                        <pic:blipFill>
+                          <a:blip r:embed="rId8" cstate="none"/>
+                          <a:srcRect/>
+                          <a:stretch>
+                            <a:fillRect/>
+                          </a:stretch>
+                        </pic:blipFill>
+                        <pic:spPr bwMode="auto">
+                          <a:xfrm>
+                            <a:off x="0" y="0"/>
+                            <a:ext cx="1428750" cy="1971675"/>
+                          </a:xfrm>
+                          <a:prstGeom prst="rect">
+                            <a:avLst/>
+                          </a:prstGeom>
+                        </pic:spPr>
+                      </pic:pic>
+                    </a:graphicData>
+                  </a:graphic>
+                </wp:inline>
+              </w:drawing>
+            </w:r>
+          </w:p>
+          <w:p>
+            <w:pPr>
+              <w:spacing w:before="60"/>
+              <w:jc w:val="center"/>
+            </w:pPr>
+            <w:r>
+              <w:rPr>
+                <w:rFonts w:ascii="Arial" w:cs="Arial" w:eastAsia="Microsoft JhengHei" w:hAnsi="Arial"/>
+                <w:b/>
+                <w:bCs/>
+              </w:rPr>
+              <w:t xml:space="preserve">第 3 項　馬達 2 固定座</w:t>
+            </w:r>
+          </w:p>
+          <w:p>
+            <w:pPr>
+              <w:jc w:val="center"/>
+            </w:pPr>
+            <w:r>
+              <w:rPr>
+                <w:rFonts w:ascii="Arial" w:cs="Arial" w:eastAsia="Microsoft JhengHei" w:hAnsi="Arial"/>
+                <w:sz w:val="18"/>
+                <w:szCs w:val="18"/>
+              </w:rPr>
+              <w:t xml:space="preserve">Motor_holder_SO101_Base.stl</w:t>
+            </w:r>
+          </w:p>
+          <w:p>
+            <w:pPr>
+              <w:jc w:val="center"/>
+            </w:pPr>
+            <w:r>
+              <w:rPr>
+                <w:rFonts w:ascii="Arial" w:cs="Arial" w:eastAsia="Microsoft JhengHei" w:hAnsi="Arial"/>
+                <w:color w:val="4C5C54"/>
+                <w:sz w:val="18"/>
+                <w:szCs w:val="18"/>
+              </w:rPr>
+              <w:t xml:space="preserve">底下有小卡勾　55.1 × 38.1 × 28.0 mm</w:t>
+            </w:r>
+          </w:p>
+        </w:tc>
+        <w:tc>
+          <w:tcPr>
+            <w:tcW w:type="dxa" w:w="4819"/>
+            <w:tcBorders>
+              <w:top w:val="single" w:color="CFD9D3" w:sz="4"/>
+              <w:left w:val="single" w:color="CFD9D3" w:sz="4"/>
+              <w:bottom w:val="single" w:color="CFD9D3" w:sz="4"/>
+              <w:right w:val="single" w:color="CFD9D3" w:sz="4"/>
+            </w:tcBorders>
+            <w:tcMar>
+              <w:top w:type="dxa" w:w="80"/>
+              <w:left w:type="dxa" w:w="110"/>
+              <w:bottom w:type="dxa" w:w="80"/>
+              <w:right w:type="dxa" w:w="110"/>
+            </w:tcMar>
+          </w:tcPr>
+          <w:p>
+            <w:pPr>
+              <w:jc w:val="center"/>
+            </w:pPr>
+            <w:r>
+              <w:drawing>
+                <wp:inline distT="0" distB="0" distL="0" distR="0">
+                  <wp:extent cx="1428750" cy="1933575"/>
+                  <wp:effectExtent t="0" r="0" b="0" l="0"/>
+                  <wp:docPr id="2" name="Motor_holder_SO101_Wrist" descr="第 7 項　馬達 4 固定座，底邊平的有橫紋　56.4 × 36.9 × 28.0 mm" title="Motor_holder_SO101_Wrist"/>
+                  <wp:cNvGraphicFramePr>
+                    <a:graphicFrameLocks xmlns:a="http://schemas.openxmlformats.org/drawingml/2006/main" noChangeAspect="1"/>
+                  </wp:cNvGraphicFramePr>
+                  <a:graphic xmlns:a="http://schemas.openxmlformats.org/drawingml/2006/main">
+                    <a:graphicData uri="http://schemas.openxmlformats.org/drawingml/2006/picture">
+                      <pic:pic xmlns:pic="http://schemas.openxmlformats.org/drawingml/2006/picture">
+                        <pic:nvPicPr>
+                          <pic:cNvPr id="0" name="" descr=""/>
+                          <pic:cNvPicPr>
+                            <a:picLocks noChangeAspect="1" noChangeArrowheads="1"/>
+                          </pic:cNvPicPr>
+                        </pic:nvPicPr>
+                        <pic:blipFill>
+                          <a:blip r:embed="rId9" cstate="none"/>
+                          <a:srcRect/>
+                          <a:stretch>
+                            <a:fillRect/>
+                          </a:stretch>
+                        </pic:blipFill>
+                        <pic:spPr bwMode="auto">
+                          <a:xfrm>
+                            <a:off x="0" y="0"/>
+                            <a:ext cx="1428750" cy="1933575"/>
+                          </a:xfrm>
+                          <a:prstGeom prst="rect">
+                            <a:avLst/>
+                          </a:prstGeom>
+                        </pic:spPr>
+                      </pic:pic>
+                    </a:graphicData>
+                  </a:graphic>
+                </wp:inline>
+              </w:drawing>
+            </w:r>
+          </w:p>
+          <w:p>
+            <w:pPr>
+              <w:spacing w:before="60"/>
+              <w:jc w:val="center"/>
+            </w:pPr>
+            <w:r>
+              <w:rPr>
+                <w:rFonts w:ascii="Arial" w:cs="Arial" w:eastAsia="Microsoft JhengHei" w:hAnsi="Arial"/>
+                <w:b/>
+                <w:bCs/>
+              </w:rPr>
+              <w:t xml:space="preserve">第 7 項　馬達 4 固定座</w:t>
+            </w:r>
+          </w:p>
+          <w:p>
+            <w:pPr>
+              <w:jc w:val="center"/>
+            </w:pPr>
+            <w:r>
+              <w:rPr>
+                <w:rFonts w:ascii="Arial" w:cs="Arial" w:eastAsia="Microsoft JhengHei" w:hAnsi="Arial"/>
+                <w:sz w:val="18"/>
+                <w:szCs w:val="18"/>
+              </w:rPr>
+              <w:t xml:space="preserve">Motor_holder_SO101_Wrist.stl</w:t>
+            </w:r>
+          </w:p>
+          <w:p>
+            <w:pPr>
+              <w:jc w:val="center"/>
+            </w:pPr>
+            <w:r>
+              <w:rPr>
+                <w:rFonts w:ascii="Arial" w:cs="Arial" w:eastAsia="Microsoft JhengHei" w:hAnsi="Arial"/>
+                <w:color w:val="4C5C54"/>
+                <w:sz w:val="18"/>
+                <w:szCs w:val="18"/>
+              </w:rPr>
+              <w:t xml:space="preserve">底邊平的有橫紋　56.4 × 36.9 × 28.0 mm</w:t>
             </w:r>
           </w:p>
         </w:tc>
@@ -4403,6 +4653,73 @@
                 <w:rFonts w:ascii="Arial" w:cs="Arial" w:eastAsia="Microsoft JhengHei" w:hAnsi="Arial"/>
               </w:rPr>
               <w:t xml:space="preserve">活動爪 Moving_Jaw 尖端包裝時有保護</w:t>
+            </w:r>
+          </w:p>
+        </w:tc>
+        <w:tc>
+          <w:tcPr>
+            <w:tcW w:type="dxa" w:w="2200"/>
+            <w:tcBorders>
+              <w:top w:val="single" w:color="CFD9D3" w:sz="4"/>
+              <w:left w:val="single" w:color="CFD9D3" w:sz="4"/>
+              <w:bottom w:val="single" w:color="CFD9D3" w:sz="4"/>
+              <w:right w:val="single" w:color="CFD9D3" w:sz="4"/>
+            </w:tcBorders>
+            <w:tcMar>
+              <w:top w:type="dxa" w:w="60"/>
+              <w:left w:type="dxa" w:w="110"/>
+              <w:bottom w:type="dxa" w:w="60"/>
+              <w:right w:type="dxa" w:w="110"/>
+            </w:tcMar>
+          </w:tcPr>
+          <w:p>
+            <w:pPr>
+              <w:spacing w:after="40" w:before="40"/>
+              <w:jc w:val="center"/>
+            </w:pPr>
+            <w:r>
+              <w:rPr>
+                <w:rFonts w:ascii="Arial" w:cs="Arial" w:eastAsia="Microsoft JhengHei" w:hAnsi="Arial"/>
+              </w:rPr>
+              <w:t xml:space="preserve">☐</w:t>
+            </w:r>
+          </w:p>
+        </w:tc>
+      </w:tr>
+      <w:tr>
+        <w:tc>
+          <w:tcPr>
+            <w:tcW w:type="dxa" w:w="7438"/>
+            <w:tcBorders>
+              <w:top w:val="single" w:color="CFD9D3" w:sz="4"/>
+              <w:left w:val="single" w:color="CFD9D3" w:sz="4"/>
+              <w:bottom w:val="single" w:color="CFD9D3" w:sz="4"/>
+              <w:right w:val="single" w:color="CFD9D3" w:sz="4"/>
+            </w:tcBorders>
+            <w:tcMar>
+              <w:top w:type="dxa" w:w="60"/>
+              <w:left w:type="dxa" w:w="110"/>
+              <w:bottom w:type="dxa" w:w="60"/>
+              <w:right w:type="dxa" w:w="110"/>
+            </w:tcMar>
+          </w:tcPr>
+          <w:p>
+            <w:pPr>
+              <w:spacing w:after="40" w:before="40"/>
+            </w:pPr>
+            <w:r>
+              <w:rPr>
+                <w:rFonts w:ascii="Arial" w:cs="Arial" w:eastAsia="Microsoft JhengHei" w:hAnsi="Arial"/>
+                <w:b/>
+                <w:bCs/>
+              </w:rPr>
+              <w:t xml:space="preserve">每種零件分袋包裝，袋子上標示檔名</w:t>
+            </w:r>
+            <w:r>
+              <w:rPr>
+                <w:rFonts w:ascii="Arial" w:cs="Arial" w:eastAsia="Microsoft JhengHei" w:hAnsi="Arial"/>
+              </w:rPr>
+              <w:t xml:space="preserve">（第 3 項和第 7 項外形很像）</w:t>
             </w:r>
           </w:p>
         </w:tc>

</xml_diff>

<commit_message>
SO-101 SOP: explain the 15th file in the STL zip
Co-Authored-By: Claude Opus 5.5 <noreply@anthropic.com>
Claude-Session: https://claude.ai/code/session_01HbQ629ftEA4G6DUwmdU6eA
</commit_message>
<xml_diff>
--- a/so101/docs/SO-101_廠商列印需求說明.docx
+++ b/so101/docs/SO-101_廠商列印需求說明.docx
@@ -2609,7 +2609,7 @@
                 <w:bCs/>
                 <w:color w:val="8F5B00"/>
               </w:rPr>
-              <w:t xml:space="preserve">請注意</w:t>
+              <w:t xml:space="preserve">請注意：資料夾裡的檔案比表格多</w:t>
             </w:r>
           </w:p>
           <w:p>
@@ -2620,7 +2620,7 @@
               <w:rPr>
                 <w:rFonts w:ascii="Arial" w:cs="Arial" w:eastAsia="Microsoft JhengHei" w:hAnsi="Arial"/>
               </w:rPr>
-              <w:t xml:space="preserve">請</w:t>
+              <w:t xml:space="preserve">附件 zip 的 Individual 資料夾有 </w:t>
             </w:r>
             <w:r>
               <w:rPr>
@@ -2628,13 +2628,69 @@
                 <w:b/>
                 <w:bCs/>
               </w:rPr>
-              <w:t xml:space="preserve">不要印 SO101 Assembly.stl</w:t>
-            </w:r>
-            <w:r>
-              <w:rPr>
-                <w:rFonts w:ascii="Arial" w:cs="Arial" w:eastAsia="Microsoft JhengHei" w:hAnsi="Arial"/>
-              </w:rPr>
-              <w:t xml:space="preserve">，那是整隻手臂的參考模型，不是零件。驅動板固定板只印 Waveshare 版，Seeedstudio_Mounting_Plate_SO101 不用印。</w:t>
+              <w:t xml:space="preserve">15 個</w:t>
+            </w:r>
+            <w:r>
+              <w:rPr>
+                <w:rFonts w:ascii="Arial" w:cs="Arial" w:eastAsia="Microsoft JhengHei" w:hAnsi="Arial"/>
+              </w:rPr>
+              <w:t xml:space="preserve">檔案，表格只有 14 種。多出來的 </w:t>
+            </w:r>
+            <w:r>
+              <w:rPr>
+                <w:rFonts w:ascii="Arial" w:cs="Arial" w:eastAsia="Microsoft JhengHei" w:hAnsi="Arial"/>
+                <w:b/>
+                <w:bCs/>
+              </w:rPr>
+              <w:t xml:space="preserve">Seeedstudio_Mounting_Plate_SO101.stl</w:t>
+            </w:r>
+            <w:r>
+              <w:rPr>
+                <w:rFonts w:ascii="Arial" w:cs="Arial" w:eastAsia="Microsoft JhengHei" w:hAnsi="Arial"/>
+              </w:rPr>
+              <w:t xml:space="preserve"> 是另一個品牌驅動板用的固定板，這次</w:t>
+            </w:r>
+            <w:r>
+              <w:rPr>
+                <w:rFonts w:ascii="Arial" w:cs="Arial" w:eastAsia="Microsoft JhengHei" w:hAnsi="Arial"/>
+                <w:b/>
+                <w:bCs/>
+              </w:rPr>
+              <w:t xml:space="preserve">不用印</w:t>
+            </w:r>
+            <w:r>
+              <w:rPr>
+                <w:rFonts w:ascii="Arial" w:cs="Arial" w:eastAsia="Microsoft JhengHei" w:hAnsi="Arial"/>
+              </w:rPr>
+              <w:t xml:space="preserve">。如果是從 GitHub 下載，資料夾裡是 16 個檔案，另外多一個 </w:t>
+            </w:r>
+            <w:r>
+              <w:rPr>
+                <w:rFonts w:ascii="Arial" w:cs="Arial" w:eastAsia="Microsoft JhengHei" w:hAnsi="Arial"/>
+                <w:b/>
+                <w:bCs/>
+              </w:rPr>
+              <w:t xml:space="preserve">SO101 Assembly.stl</w:t>
+            </w:r>
+            <w:r>
+              <w:rPr>
+                <w:rFonts w:ascii="Arial" w:cs="Arial" w:eastAsia="Microsoft JhengHei" w:hAnsi="Arial"/>
+              </w:rPr>
+              <w:t xml:space="preserve">，那是整隻手臂的參考模型，也</w:t>
+            </w:r>
+            <w:r>
+              <w:rPr>
+                <w:rFonts w:ascii="Arial" w:cs="Arial" w:eastAsia="Microsoft JhengHei" w:hAnsi="Arial"/>
+                <w:b/>
+                <w:bCs/>
+              </w:rPr>
+              <w:t xml:space="preserve">不要印</w:t>
+            </w:r>
+            <w:r>
+              <w:rPr>
+                <w:rFonts w:ascii="Arial" w:cs="Arial" w:eastAsia="Microsoft JhengHei" w:hAnsi="Arial"/>
+              </w:rPr>
+              <w:t xml:space="preserve">。</w:t>
             </w:r>
           </w:p>
         </w:tc>

</xml_diff>

<commit_message>
SO-101 SOP: vendor brief with totals and gauge choices
Co-Authored-By: Claude Opus 5.5 <noreply@anthropic.com>
Claude-Session: https://claude.ai/code/session_01HbQ629ftEA4G6DUwmdU6eA
</commit_message>
<xml_diff>
--- a/so101/docs/SO-101_廠商列印需求說明.docx
+++ b/so101/docs/SO-101_廠商列印需求說明.docx
@@ -22,7 +22,7 @@
           <w:rFonts w:ascii="Arial" w:cs="Arial" w:eastAsia="Microsoft JhengHei" w:hAnsi="Arial"/>
           <w:color w:val="4C5C54"/>
         </w:rPr>
-        <w:t xml:space="preserve">開源機械手臂 SO-101 結構零件　材料 PLA+　共 23 件，另加量規 2 件</w:t>
+        <w:t xml:space="preserve">開源機械手臂 SO-101 結構零件　材料 PLA+　零件 23 件＋量規 2 件，總共 25 件</w:t>
       </w:r>
     </w:p>
     <w:tbl>
@@ -458,7 +458,7 @@
               <w:rPr>
                 <w:rFonts w:ascii="Arial" w:cs="Arial" w:eastAsia="Microsoft JhengHei" w:hAnsi="Arial"/>
               </w:rPr>
-              <w:t xml:space="preserve">PLA+</w:t>
+              <w:t xml:space="preserve">PLA+，FDM 熱熔列印</w:t>
             </w:r>
           </w:p>
         </w:tc>
@@ -486,7 +486,7 @@
               <w:rPr>
                 <w:rFonts w:ascii="Arial" w:cs="Arial" w:eastAsia="Microsoft JhengHei" w:hAnsi="Arial"/>
               </w:rPr>
-              <w:t xml:space="preserve">數量</w:t>
+              <w:t xml:space="preserve">總數量</w:t>
             </w:r>
           </w:p>
         </w:tc>
@@ -513,8 +513,16 @@
             <w:r>
               <w:rPr>
                 <w:rFonts w:ascii="Arial" w:cs="Arial" w:eastAsia="Microsoft JhengHei" w:hAnsi="Arial"/>
-              </w:rPr>
-              <w:t xml:space="preserve">23 件＋量規 2 件</w:t>
+                <w:b/>
+                <w:bCs/>
+              </w:rPr>
+              <w:t xml:space="preserve">25 件</w:t>
+            </w:r>
+            <w:r>
+              <w:rPr>
+                <w:rFonts w:ascii="Arial" w:cs="Arial" w:eastAsia="Microsoft JhengHei" w:hAnsi="Arial"/>
+              </w:rPr>
+              <w:t xml:space="preserve">（零件 23＋量規 2）</w:t>
             </w:r>
           </w:p>
         </w:tc>
@@ -2586,6 +2594,114 @@
             <w:tcW w:type="dxa" w:w="9638"/>
             <w:tcBorders>
               <w:top w:val="none" w:color="FFFFFF" w:sz="0"/>
+              <w:left w:val="single" w:color="1D6B4F" w:sz="24"/>
+              <w:bottom w:val="none" w:color="FFFFFF" w:sz="0"/>
+              <w:right w:val="none" w:color="FFFFFF" w:sz="0"/>
+            </w:tcBorders>
+            <w:shd w:fill="DCEBE3" w:color="auto" w:val="clear"/>
+            <w:tcMar>
+              <w:top w:type="dxa" w:w="100"/>
+              <w:left w:type="dxa" w:w="180"/>
+              <w:bottom w:type="dxa" w:w="100"/>
+              <w:right w:type="dxa" w:w="180"/>
+            </w:tcMar>
+          </w:tcPr>
+          <w:p>
+            <w:pPr>
+              <w:spacing w:after="60"/>
+            </w:pPr>
+            <w:r>
+              <w:rPr>
+                <w:rFonts w:ascii="Arial" w:cs="Arial" w:eastAsia="Microsoft JhengHei" w:hAnsi="Arial"/>
+                <w:b/>
+                <w:bCs/>
+                <w:color w:val="1D6B4F"/>
+              </w:rPr>
+              <w:t xml:space="preserve">總數一次看清楚</w:t>
+            </w:r>
+          </w:p>
+          <w:p>
+            <w:pPr>
+              <w:spacing w:line="300"/>
+            </w:pPr>
+            <w:r>
+              <w:rPr>
+                <w:rFonts w:ascii="Arial" w:cs="Arial" w:eastAsia="Microsoft JhengHei" w:hAnsi="Arial"/>
+              </w:rPr>
+              <w:t xml:space="preserve">附件 zip 裡共有 </w:t>
+            </w:r>
+            <w:r>
+              <w:rPr>
+                <w:rFonts w:ascii="Arial" w:cs="Arial" w:eastAsia="Microsoft JhengHei" w:hAnsi="Arial"/>
+                <w:b/>
+                <w:bCs/>
+              </w:rPr>
+              <w:t xml:space="preserve">19 個 STL</w:t>
+            </w:r>
+            <w:r>
+              <w:rPr>
+                <w:rFonts w:ascii="Arial" w:cs="Arial" w:eastAsia="Microsoft JhengHei" w:hAnsi="Arial"/>
+              </w:rPr>
+              <w:t xml:space="preserve">：Individual 資料夾 15 個、Gauges 資料夾 4 個。其中 </w:t>
+            </w:r>
+            <w:r>
+              <w:rPr>
+                <w:rFonts w:ascii="Arial" w:cs="Arial" w:eastAsia="Microsoft JhengHei" w:hAnsi="Arial"/>
+                <w:b/>
+                <w:bCs/>
+              </w:rPr>
+              <w:t xml:space="preserve">3 個不用印</w:t>
+            </w:r>
+            <w:r>
+              <w:rPr>
+                <w:rFonts w:ascii="Arial" w:cs="Arial" w:eastAsia="Microsoft JhengHei" w:hAnsi="Arial"/>
+              </w:rPr>
+              <w:t xml:space="preserve">：Seeedstudio_Mounting_Plate_SO101、Lego_Size_Test_02_zero、Lego_Size_Test_02_minuspoint1。其餘 16 種照數量列印，</w:t>
+            </w:r>
+            <w:r>
+              <w:rPr>
+                <w:rFonts w:ascii="Arial" w:cs="Arial" w:eastAsia="Microsoft JhengHei" w:hAnsi="Arial"/>
+                <w:b/>
+                <w:bCs/>
+              </w:rPr>
+              <w:t xml:space="preserve">總共 25 件</w:t>
+            </w:r>
+            <w:r>
+              <w:rPr>
+                <w:rFonts w:ascii="Arial" w:cs="Arial" w:eastAsia="Microsoft JhengHei" w:hAnsi="Arial"/>
+              </w:rPr>
+              <w:t xml:space="preserve">：上表零件 23 件，加上第四節的量規 2 件。</w:t>
+            </w:r>
+          </w:p>
+        </w:tc>
+      </w:tr>
+    </w:tbl>
+    <w:p>
+      <w:pPr>
+        <w:spacing w:after="60"/>
+      </w:pPr>
+    </w:p>
+    <w:tbl>
+      <w:tblPr>
+        <w:tblW w:type="dxa" w:w="9638"/>
+        <w:tblBorders>
+          <w:top w:val="single" w:color="auto" w:sz="4"/>
+          <w:left w:val="single" w:color="auto" w:sz="4"/>
+          <w:bottom w:val="single" w:color="auto" w:sz="4"/>
+          <w:right w:val="single" w:color="auto" w:sz="4"/>
+          <w:insideH w:val="single" w:color="auto" w:sz="4"/>
+          <w:insideV w:val="single" w:color="auto" w:sz="4"/>
+        </w:tblBorders>
+      </w:tblPr>
+      <w:tblGrid>
+        <w:gridCol w:w="9638"/>
+      </w:tblGrid>
+      <w:tr>
+        <w:tc>
+          <w:tcPr>
+            <w:tcW w:type="dxa" w:w="9638"/>
+            <w:tcBorders>
+              <w:top w:val="none" w:color="FFFFFF" w:sz="0"/>
               <w:left w:val="single" w:color="8F5B00" w:sz="24"/>
               <w:bottom w:val="none" w:color="FFFFFF" w:sz="0"/>
               <w:right w:val="none" w:color="FFFFFF" w:sz="0"/>
@@ -3103,6 +3219,26 @@
                 <w:bCs/>
               </w:rPr>
               <w:t xml:space="preserve">PLA+</w:t>
+            </w:r>
+            <w:r>
+              <w:rPr>
+                <w:rFonts w:ascii="Arial" w:cs="Arial" w:eastAsia="Microsoft JhengHei" w:hAnsi="Arial"/>
+              </w:rPr>
+              <w:t xml:space="preserve">，用 </w:t>
+            </w:r>
+            <w:r>
+              <w:rPr>
+                <w:rFonts w:ascii="Arial" w:cs="Arial" w:eastAsia="Microsoft JhengHei" w:hAnsi="Arial"/>
+                <w:b/>
+                <w:bCs/>
+              </w:rPr>
+              <w:t xml:space="preserve">FDM 熱熔列印</w:t>
+            </w:r>
+            <w:r>
+              <w:rPr>
+                <w:rFonts w:ascii="Arial" w:cs="Arial" w:eastAsia="Microsoft JhengHei" w:hAnsi="Arial"/>
+              </w:rPr>
+              <w:t xml:space="preserve">。請不要用光固化樹脂，樹脂零件太重、太脆，不適合這支手臂。</w:t>
             </w:r>
           </w:p>
         </w:tc>
@@ -3646,7 +3782,7 @@
         <w:rPr>
           <w:rFonts w:ascii="Arial" w:cs="Arial" w:eastAsia="Microsoft JhengHei" w:hAnsi="Arial"/>
         </w:rPr>
-        <w:t xml:space="preserve">正式下單前，請先用同一捲線材、同一組參數印下面兩個量規，寄給我們試裝馬達：</w:t>
+        <w:t xml:space="preserve">正式下單前，請先用同一捲線材、同一組參數印量規，寄給我們試裝馬達。zip 的 Gauges 資料夾有 4 個檔案，只印前 2 個：</w:t>
       </w:r>
     </w:p>
     <w:tbl>
@@ -3663,8 +3799,9 @@
         <w:tblLayout w:type="fixed"/>
       </w:tblPr>
       <w:tblGrid>
-        <w:gridCol w:w="4819"/>
-        <w:gridCol w:w="4819"/>
+        <w:gridCol w:w="4200"/>
+        <w:gridCol w:w="3438"/>
+        <w:gridCol w:w="2000"/>
       </w:tblGrid>
       <w:tr>
         <w:trPr>
@@ -3672,7 +3809,7 @@
         </w:trPr>
         <w:tc>
           <w:tcPr>
-            <w:tcW w:type="dxa" w:w="4819"/>
+            <w:tcW w:type="dxa" w:w="4200"/>
             <w:tcBorders>
               <w:top w:val="single" w:color="CFD9D3" w:sz="4"/>
               <w:left w:val="single" w:color="CFD9D3" w:sz="4"/>
@@ -3704,7 +3841,7 @@
         </w:tc>
         <w:tc>
           <w:tcPr>
-            <w:tcW w:type="dxa" w:w="4819"/>
+            <w:tcW w:type="dxa" w:w="3438"/>
             <w:tcBorders>
               <w:top w:val="single" w:color="CFD9D3" w:sz="4"/>
               <w:left w:val="single" w:color="CFD9D3" w:sz="4"/>
@@ -3730,7 +3867,39 @@
                 <w:bCs/>
                 <w:color w:val="FFFFFF"/>
               </w:rPr>
-              <w:t xml:space="preserve">位置</w:t>
+              <w:t xml:space="preserve">用途</w:t>
+            </w:r>
+          </w:p>
+        </w:tc>
+        <w:tc>
+          <w:tcPr>
+            <w:tcW w:type="dxa" w:w="2000"/>
+            <w:tcBorders>
+              <w:top w:val="single" w:color="CFD9D3" w:sz="4"/>
+              <w:left w:val="single" w:color="CFD9D3" w:sz="4"/>
+              <w:bottom w:val="single" w:color="CFD9D3" w:sz="4"/>
+              <w:right w:val="single" w:color="CFD9D3" w:sz="4"/>
+            </w:tcBorders>
+            <w:shd w:fill="1D6B4F" w:color="auto" w:val="clear"/>
+            <w:tcMar>
+              <w:top w:type="dxa" w:w="60"/>
+              <w:left w:type="dxa" w:w="110"/>
+              <w:bottom w:type="dxa" w:w="60"/>
+              <w:right w:type="dxa" w:w="110"/>
+            </w:tcMar>
+          </w:tcPr>
+          <w:p>
+            <w:pPr>
+              <w:spacing w:after="40" w:before="40"/>
+            </w:pPr>
+            <w:r>
+              <w:rPr>
+                <w:rFonts w:ascii="Arial" w:cs="Arial" w:eastAsia="Microsoft JhengHei" w:hAnsi="Arial"/>
+                <w:b/>
+                <w:bCs/>
+                <w:color w:val="FFFFFF"/>
+              </w:rPr>
+              <w:t xml:space="preserve">數量</w:t>
             </w:r>
           </w:p>
         </w:tc>
@@ -3738,7 +3907,7 @@
       <w:tr>
         <w:tc>
           <w:tcPr>
-            <w:tcW w:type="dxa" w:w="4819"/>
+            <w:tcW w:type="dxa" w:w="4200"/>
             <w:tcBorders>
               <w:top w:val="single" w:color="CFD9D3" w:sz="4"/>
               <w:left w:val="single" w:color="CFD9D3" w:sz="4"/>
@@ -3766,29 +3935,60 @@
         </w:tc>
         <w:tc>
           <w:tcPr>
-            <w:tcW w:type="dxa" w:w="4819"/>
-            <w:tcBorders>
-              <w:top w:val="single" w:color="CFD9D3" w:sz="4"/>
-              <w:left w:val="single" w:color="CFD9D3" w:sz="4"/>
-              <w:bottom w:val="single" w:color="CFD9D3" w:sz="4"/>
-              <w:right w:val="single" w:color="CFD9D3" w:sz="4"/>
-            </w:tcBorders>
-            <w:tcMar>
-              <w:top w:type="dxa" w:w="60"/>
-              <w:left w:type="dxa" w:w="110"/>
-              <w:bottom w:type="dxa" w:w="60"/>
-              <w:right w:type="dxa" w:w="110"/>
-            </w:tcMar>
-          </w:tcPr>
-          <w:p>
-            <w:pPr>
-              <w:spacing w:after="40" w:before="40"/>
-            </w:pPr>
-            <w:r>
-              <w:rPr>
-                <w:rFonts w:ascii="Arial" w:cs="Arial" w:eastAsia="Microsoft JhengHei" w:hAnsi="Arial"/>
-              </w:rPr>
-              <w:t xml:space="preserve">zip 內的 Gauges 資料夾</w:t>
+            <w:tcW w:type="dxa" w:w="3438"/>
+            <w:tcBorders>
+              <w:top w:val="single" w:color="CFD9D3" w:sz="4"/>
+              <w:left w:val="single" w:color="CFD9D3" w:sz="4"/>
+              <w:bottom w:val="single" w:color="CFD9D3" w:sz="4"/>
+              <w:right w:val="single" w:color="CFD9D3" w:sz="4"/>
+            </w:tcBorders>
+            <w:tcMar>
+              <w:top w:type="dxa" w:w="60"/>
+              <w:left w:type="dxa" w:w="110"/>
+              <w:bottom w:type="dxa" w:w="60"/>
+              <w:right w:type="dxa" w:w="110"/>
+            </w:tcMar>
+          </w:tcPr>
+          <w:p>
+            <w:pPr>
+              <w:spacing w:after="40" w:before="40"/>
+            </w:pPr>
+            <w:r>
+              <w:rPr>
+                <w:rFonts w:ascii="Arial" w:cs="Arial" w:eastAsia="Microsoft JhengHei" w:hAnsi="Arial"/>
+              </w:rPr>
+              <w:t xml:space="preserve">用馬達試塞的量規</w:t>
+            </w:r>
+          </w:p>
+        </w:tc>
+        <w:tc>
+          <w:tcPr>
+            <w:tcW w:type="dxa" w:w="2000"/>
+            <w:tcBorders>
+              <w:top w:val="single" w:color="CFD9D3" w:sz="4"/>
+              <w:left w:val="single" w:color="CFD9D3" w:sz="4"/>
+              <w:bottom w:val="single" w:color="CFD9D3" w:sz="4"/>
+              <w:right w:val="single" w:color="CFD9D3" w:sz="4"/>
+            </w:tcBorders>
+            <w:tcMar>
+              <w:top w:type="dxa" w:w="60"/>
+              <w:left w:type="dxa" w:w="110"/>
+              <w:bottom w:type="dxa" w:w="60"/>
+              <w:right w:type="dxa" w:w="110"/>
+            </w:tcMar>
+          </w:tcPr>
+          <w:p>
+            <w:pPr>
+              <w:spacing w:after="40" w:before="40"/>
+              <w:jc w:val="center"/>
+            </w:pPr>
+            <w:r>
+              <w:rPr>
+                <w:rFonts w:ascii="Arial" w:cs="Arial" w:eastAsia="Microsoft JhengHei" w:hAnsi="Arial"/>
+                <w:b/>
+                <w:bCs/>
+              </w:rPr>
+              <w:t xml:space="preserve">1</w:t>
             </w:r>
           </w:p>
         </w:tc>
@@ -3796,7 +3996,7 @@
       <w:tr>
         <w:tc>
           <w:tcPr>
-            <w:tcW w:type="dxa" w:w="4819"/>
+            <w:tcW w:type="dxa" w:w="4200"/>
             <w:tcBorders>
               <w:top w:val="single" w:color="CFD9D3" w:sz="4"/>
               <w:left w:val="single" w:color="CFD9D3" w:sz="4"/>
@@ -3824,29 +4024,240 @@
         </w:tc>
         <w:tc>
           <w:tcPr>
-            <w:tcW w:type="dxa" w:w="4819"/>
-            <w:tcBorders>
-              <w:top w:val="single" w:color="CFD9D3" w:sz="4"/>
-              <w:left w:val="single" w:color="CFD9D3" w:sz="4"/>
-              <w:bottom w:val="single" w:color="CFD9D3" w:sz="4"/>
-              <w:right w:val="single" w:color="CFD9D3" w:sz="4"/>
-            </w:tcBorders>
-            <w:tcMar>
-              <w:top w:type="dxa" w:w="60"/>
-              <w:left w:type="dxa" w:w="110"/>
-              <w:bottom w:type="dxa" w:w="60"/>
-              <w:right w:type="dxa" w:w="110"/>
-            </w:tcMar>
-          </w:tcPr>
-          <w:p>
-            <w:pPr>
-              <w:spacing w:after="40" w:before="40"/>
-            </w:pPr>
-            <w:r>
-              <w:rPr>
-                <w:rFonts w:ascii="Arial" w:cs="Arial" w:eastAsia="Microsoft JhengHei" w:hAnsi="Arial"/>
-              </w:rPr>
-              <w:t xml:space="preserve">zip 內的 Gauges 資料夾</w:t>
+            <w:tcW w:type="dxa" w:w="3438"/>
+            <w:tcBorders>
+              <w:top w:val="single" w:color="CFD9D3" w:sz="4"/>
+              <w:left w:val="single" w:color="CFD9D3" w:sz="4"/>
+              <w:bottom w:val="single" w:color="CFD9D3" w:sz="4"/>
+              <w:right w:val="single" w:color="CFD9D3" w:sz="4"/>
+            </w:tcBorders>
+            <w:tcMar>
+              <w:top w:type="dxa" w:w="60"/>
+              <w:left w:type="dxa" w:w="110"/>
+              <w:bottom w:type="dxa" w:w="60"/>
+              <w:right w:type="dxa" w:w="110"/>
+            </w:tcMar>
+          </w:tcPr>
+          <w:p>
+            <w:pPr>
+              <w:spacing w:after="40" w:before="40"/>
+            </w:pPr>
+            <w:r>
+              <w:rPr>
+                <w:rFonts w:ascii="Arial" w:cs="Arial" w:eastAsia="Microsoft JhengHei" w:hAnsi="Arial"/>
+              </w:rPr>
+              <w:t xml:space="preserve">用馬達試塞的量規，較緊</w:t>
+            </w:r>
+          </w:p>
+        </w:tc>
+        <w:tc>
+          <w:tcPr>
+            <w:tcW w:type="dxa" w:w="2000"/>
+            <w:tcBorders>
+              <w:top w:val="single" w:color="CFD9D3" w:sz="4"/>
+              <w:left w:val="single" w:color="CFD9D3" w:sz="4"/>
+              <w:bottom w:val="single" w:color="CFD9D3" w:sz="4"/>
+              <w:right w:val="single" w:color="CFD9D3" w:sz="4"/>
+            </w:tcBorders>
+            <w:tcMar>
+              <w:top w:type="dxa" w:w="60"/>
+              <w:left w:type="dxa" w:w="110"/>
+              <w:bottom w:type="dxa" w:w="60"/>
+              <w:right w:type="dxa" w:w="110"/>
+            </w:tcMar>
+          </w:tcPr>
+          <w:p>
+            <w:pPr>
+              <w:spacing w:after="40" w:before="40"/>
+              <w:jc w:val="center"/>
+            </w:pPr>
+            <w:r>
+              <w:rPr>
+                <w:rFonts w:ascii="Arial" w:cs="Arial" w:eastAsia="Microsoft JhengHei" w:hAnsi="Arial"/>
+                <w:b/>
+                <w:bCs/>
+              </w:rPr>
+              <w:t xml:space="preserve">1</w:t>
+            </w:r>
+          </w:p>
+        </w:tc>
+      </w:tr>
+      <w:tr>
+        <w:tc>
+          <w:tcPr>
+            <w:tcW w:type="dxa" w:w="4200"/>
+            <w:tcBorders>
+              <w:top w:val="single" w:color="CFD9D3" w:sz="4"/>
+              <w:left w:val="single" w:color="CFD9D3" w:sz="4"/>
+              <w:bottom w:val="single" w:color="CFD9D3" w:sz="4"/>
+              <w:right w:val="single" w:color="CFD9D3" w:sz="4"/>
+            </w:tcBorders>
+            <w:tcMar>
+              <w:top w:type="dxa" w:w="60"/>
+              <w:left w:type="dxa" w:w="110"/>
+              <w:bottom w:type="dxa" w:w="60"/>
+              <w:right w:type="dxa" w:w="110"/>
+            </w:tcMar>
+          </w:tcPr>
+          <w:p>
+            <w:pPr>
+              <w:spacing w:after="40" w:before="40"/>
+            </w:pPr>
+            <w:r>
+              <w:rPr>
+                <w:rFonts w:ascii="Consolas" w:hAnsi="Consolas"/>
+              </w:rPr>
+              <w:t xml:space="preserve">Lego_Size_Test_02_zero.STL</w:t>
+            </w:r>
+          </w:p>
+        </w:tc>
+        <w:tc>
+          <w:tcPr>
+            <w:tcW w:type="dxa" w:w="3438"/>
+            <w:tcBorders>
+              <w:top w:val="single" w:color="CFD9D3" w:sz="4"/>
+              <w:left w:val="single" w:color="CFD9D3" w:sz="4"/>
+              <w:bottom w:val="single" w:color="CFD9D3" w:sz="4"/>
+              <w:right w:val="single" w:color="CFD9D3" w:sz="4"/>
+            </w:tcBorders>
+            <w:tcMar>
+              <w:top w:type="dxa" w:w="60"/>
+              <w:left w:type="dxa" w:w="110"/>
+              <w:bottom w:type="dxa" w:w="60"/>
+              <w:right w:type="dxa" w:w="110"/>
+            </w:tcMar>
+          </w:tcPr>
+          <w:p>
+            <w:pPr>
+              <w:spacing w:after="40" w:before="40"/>
+            </w:pPr>
+            <w:r>
+              <w:rPr>
+                <w:rFonts w:ascii="Arial" w:cs="Arial" w:eastAsia="Microsoft JhengHei" w:hAnsi="Arial"/>
+              </w:rPr>
+              <w:t xml:space="preserve">用樂高積木試塞，我們用不到</w:t>
+            </w:r>
+          </w:p>
+        </w:tc>
+        <w:tc>
+          <w:tcPr>
+            <w:tcW w:type="dxa" w:w="2000"/>
+            <w:tcBorders>
+              <w:top w:val="single" w:color="CFD9D3" w:sz="4"/>
+              <w:left w:val="single" w:color="CFD9D3" w:sz="4"/>
+              <w:bottom w:val="single" w:color="CFD9D3" w:sz="4"/>
+              <w:right w:val="single" w:color="CFD9D3" w:sz="4"/>
+            </w:tcBorders>
+            <w:tcMar>
+              <w:top w:type="dxa" w:w="60"/>
+              <w:left w:type="dxa" w:w="110"/>
+              <w:bottom w:type="dxa" w:w="60"/>
+              <w:right w:type="dxa" w:w="110"/>
+            </w:tcMar>
+          </w:tcPr>
+          <w:p>
+            <w:pPr>
+              <w:spacing w:after="40" w:before="40"/>
+              <w:jc w:val="center"/>
+            </w:pPr>
+            <w:r>
+              <w:rPr>
+                <w:rFonts w:ascii="Arial" w:cs="Arial" w:eastAsia="Microsoft JhengHei" w:hAnsi="Arial"/>
+                <w:b/>
+                <w:bCs/>
+                <w:color w:val="AE2A20"/>
+              </w:rPr>
+              <w:t xml:space="preserve">不用印</w:t>
+            </w:r>
+          </w:p>
+        </w:tc>
+      </w:tr>
+      <w:tr>
+        <w:tc>
+          <w:tcPr>
+            <w:tcW w:type="dxa" w:w="4200"/>
+            <w:tcBorders>
+              <w:top w:val="single" w:color="CFD9D3" w:sz="4"/>
+              <w:left w:val="single" w:color="CFD9D3" w:sz="4"/>
+              <w:bottom w:val="single" w:color="CFD9D3" w:sz="4"/>
+              <w:right w:val="single" w:color="CFD9D3" w:sz="4"/>
+            </w:tcBorders>
+            <w:tcMar>
+              <w:top w:type="dxa" w:w="60"/>
+              <w:left w:type="dxa" w:w="110"/>
+              <w:bottom w:type="dxa" w:w="60"/>
+              <w:right w:type="dxa" w:w="110"/>
+            </w:tcMar>
+          </w:tcPr>
+          <w:p>
+            <w:pPr>
+              <w:spacing w:after="40" w:before="40"/>
+            </w:pPr>
+            <w:r>
+              <w:rPr>
+                <w:rFonts w:ascii="Consolas" w:hAnsi="Consolas"/>
+              </w:rPr>
+              <w:t xml:space="preserve">Lego_Size_Test_02_minuspoint1.STL</w:t>
+            </w:r>
+          </w:p>
+        </w:tc>
+        <w:tc>
+          <w:tcPr>
+            <w:tcW w:type="dxa" w:w="3438"/>
+            <w:tcBorders>
+              <w:top w:val="single" w:color="CFD9D3" w:sz="4"/>
+              <w:left w:val="single" w:color="CFD9D3" w:sz="4"/>
+              <w:bottom w:val="single" w:color="CFD9D3" w:sz="4"/>
+              <w:right w:val="single" w:color="CFD9D3" w:sz="4"/>
+            </w:tcBorders>
+            <w:tcMar>
+              <w:top w:type="dxa" w:w="60"/>
+              <w:left w:type="dxa" w:w="110"/>
+              <w:bottom w:type="dxa" w:w="60"/>
+              <w:right w:type="dxa" w:w="110"/>
+            </w:tcMar>
+          </w:tcPr>
+          <w:p>
+            <w:pPr>
+              <w:spacing w:after="40" w:before="40"/>
+            </w:pPr>
+            <w:r>
+              <w:rPr>
+                <w:rFonts w:ascii="Arial" w:cs="Arial" w:eastAsia="Microsoft JhengHei" w:hAnsi="Arial"/>
+              </w:rPr>
+              <w:t xml:space="preserve">用樂高積木試塞，我們用不到</w:t>
+            </w:r>
+          </w:p>
+        </w:tc>
+        <w:tc>
+          <w:tcPr>
+            <w:tcW w:type="dxa" w:w="2000"/>
+            <w:tcBorders>
+              <w:top w:val="single" w:color="CFD9D3" w:sz="4"/>
+              <w:left w:val="single" w:color="CFD9D3" w:sz="4"/>
+              <w:bottom w:val="single" w:color="CFD9D3" w:sz="4"/>
+              <w:right w:val="single" w:color="CFD9D3" w:sz="4"/>
+            </w:tcBorders>
+            <w:tcMar>
+              <w:top w:type="dxa" w:w="60"/>
+              <w:left w:type="dxa" w:w="110"/>
+              <w:bottom w:type="dxa" w:w="60"/>
+              <w:right w:type="dxa" w:w="110"/>
+            </w:tcMar>
+          </w:tcPr>
+          <w:p>
+            <w:pPr>
+              <w:spacing w:after="40" w:before="40"/>
+              <w:jc w:val="center"/>
+            </w:pPr>
+            <w:r>
+              <w:rPr>
+                <w:rFonts w:ascii="Arial" w:cs="Arial" w:eastAsia="Microsoft JhengHei" w:hAnsi="Arial"/>
+                <w:b/>
+                <w:bCs/>
+                <w:color w:val="AE2A20"/>
+              </w:rPr>
+              <w:t xml:space="preserve">不用印</w:t>
             </w:r>
           </w:p>
         </w:tc>
@@ -4834,7 +5245,21 @@
               <w:rPr>
                 <w:rFonts w:ascii="Arial" w:cs="Arial" w:eastAsia="Microsoft JhengHei" w:hAnsi="Arial"/>
               </w:rPr>
-              <w:t xml:space="preserve">23 件數量齊全</w:t>
+              <w:t xml:space="preserve">數量齊全：零件 23 件＋量規 2 件，</w:t>
+            </w:r>
+            <w:r>
+              <w:rPr>
+                <w:rFonts w:ascii="Arial" w:cs="Arial" w:eastAsia="Microsoft JhengHei" w:hAnsi="Arial"/>
+                <w:b/>
+                <w:bCs/>
+              </w:rPr>
+              <w:t xml:space="preserve">共 25 件</w:t>
+            </w:r>
+            <w:r>
+              <w:rPr>
+                <w:rFonts w:ascii="Arial" w:cs="Arial" w:eastAsia="Microsoft JhengHei" w:hAnsi="Arial"/>
+              </w:rPr>
+              <w:t xml:space="preserve">。Motor_holder_SO101_Base 和 Motor_holder_SO101_Wrist 都是各 2 個</w:t>
             </w:r>
           </w:p>
         </w:tc>

</xml_diff>